<commit_message>
feat: enrich driver promotion packs and polish driver UI
</commit_message>
<xml_diff>
--- a/wandermind-studio/promotion-packs/Dicky/WanderMind_Dicky_Promosi_Siap_Pakai.docx
+++ b/wandermind-studio/promotion-packs/Dicky/WanderMind_Dicky_Promosi_Siap_Pakai.docx
@@ -166,7 +166,7 @@
                 <w:color w:val="FFFFFF"/>
                 <w:sz w:val="26"/>
               </w:rPr>
-              <w:t>3 foto</w:t>
+              <w:t>7 foto</w:t>
             </w:r>
           </w:p>
           <w:p>
@@ -270,7 +270,7 @@
           <w:color w:val="5E6B68"/>
           <w:sz w:val="17"/>
         </w:rPr>
-        <w:t>Versi 25 Agustus 2026 · Simpan dokumen ini di ponsel</w:t>
+        <w:t>Versi 26 Agustus 2026 · Simpan dokumen ini di ponsel</w:t>
       </w:r>
     </w:p>
     <w:p>
@@ -367,7 +367,7 @@
                 <w:b/>
                 <w:color w:val="1E2D2A"/>
               </w:rPr>
-              <w:t>Simpan tiga foto</w:t>
+              <w:t>Simpan tujuh foto</w:t>
             </w:r>
           </w:p>
           <w:p>
@@ -378,7 +378,7 @@
               <w:rPr>
                 <w:sz w:val="19"/>
               </w:rPr>
-              <w:t>Gunakan foto bernomor 01, 02, dan 03 yang ikut dalam paket ini. Foto yang sama juga tertanam di dokumen.</w:t>
+              <w:t>Gunakan foto bernomor 01–07 yang ikut dalam paket ini. Foto yang sama juga tertanam di dokumen.</w:t>
             </w:r>
           </w:p>
         </w:tc>
@@ -796,12 +796,12 @@
         <w:keepNext/>
       </w:pPr>
       <w:r>
-        <w:t>Tiga foto yang dipakai</w:t>
+        <w:t>Tiga foto utama + empat pemandangan</w:t>
       </w:r>
     </w:p>
     <w:p>
       <w:r>
-        <w:t>Urutan ini sengaja sederhana: orangnya dulu, bukti pelayanan berikutnya, kendaraan terakhir.</w:t>
+        <w:t>Foto 01–03 memperkenalkan pengemudi dan layanan. Foto 04–07 menampilkan inspirasi perjalanan Bali untuk posting kedua.</w:t>
       </w:r>
     </w:p>
     <w:tbl>
@@ -2628,7 +2628,7 @@
                 <w:b/>
                 <w:color w:val="FFFFFF"/>
               </w:rPr>
-              <w:t>Sebelum posting: tautan terbuka · nama driver terpilih · tiga foto benar · tidak ada data pribadi</w:t>
+              <w:t>Sebelum posting: tautan terbuka · nama driver terpilih · foto paket benar · tidak ada data pribadi</w:t>
             </w:r>
           </w:p>
         </w:tc>
@@ -2646,7 +2646,7 @@
         <w:t xml:space="preserve">Catatan sumber: </w:t>
       </w:r>
       <w:r>
-        <w:t xml:space="preserve">Foto dalam paket tercatat sebagai user_provided_with_consent dan disetujui pada 5 Agustus 2026. Panduan format vertikal dan safe zone mengacu pada Meta for Business. </w:t>
+        <w:t xml:space="preserve">Foto 01–03 tercatat sebagai user_provided_with_consent. Foto 04–07 memakai aset berlisensi yang kreditnya tercantum pada halaman terakhir. Panduan format vertikal dan safe zone mengacu pada Meta for Business. </w:t>
       </w:r>
       <w:hyperlink r:id="rId15">
         <w:r>
@@ -2657,6 +2657,792 @@
           <w:t>Meta Reels guidance</w:t>
         </w:r>
       </w:hyperlink>
+    </w:p>
+    <w:p>
+      <w:r>
+        <w:br w:type="page"/>
+      </w:r>
+    </w:p>
+    <w:p>
+      <w:pPr>
+        <w:spacing w:before="0" w:after="60"/>
+      </w:pPr>
+      <w:r>
+        <w:rPr>
+          <w:rFonts w:ascii="Arial" w:hAnsi="Arial"/>
+          <w:b/>
+          <w:color w:val="E0A11A"/>
+          <w:sz w:val="16"/>
+        </w:rPr>
+        <w:t>PAKET GAMBAR 04–07</w:t>
+      </w:r>
+    </w:p>
+    <w:p>
+      <w:pPr>
+        <w:keepNext/>
+        <w:spacing w:before="0" w:after="100"/>
+      </w:pPr>
+      <w:r>
+        <w:rPr>
+          <w:rFonts w:ascii="Arial" w:hAnsi="Arial"/>
+          <w:b/>
+          <w:color w:val="0B4F46"/>
+          <w:sz w:val="44"/>
+        </w:rPr>
+        <w:t>Empat pemandangan Bali untuk posting kedua</w:t>
+      </w:r>
+    </w:p>
+    <w:p>
+      <w:pPr>
+        <w:spacing w:before="0" w:after="140" w:line="269" w:lineRule="auto"/>
+      </w:pPr>
+      <w:r>
+        <w:rPr>
+          <w:rFonts w:ascii="Arial" w:hAnsi="Arial"/>
+          <w:b w:val="0"/>
+          <w:color w:val="5E6B68"/>
+          <w:sz w:val="18"/>
+        </w:rPr>
+        <w:t>Gunakan urutan 04 → 05 → 06 → 07. Foto-foto ini sudah diperiksa di daftar aset WanderMind; jangan hapus kreditnya.</w:t>
+      </w:r>
+    </w:p>
+    <w:tbl>
+      <w:tblPr>
+        <w:tblW w:type="dxa" w:w="9360"/>
+        <w:jc w:val="center"/>
+        <w:tblLayout w:type="fixed"/>
+        <w:tblLook w:firstColumn="1" w:firstRow="1" w:lastColumn="0" w:lastRow="0" w:noHBand="0" w:noVBand="1" w:val="04A0"/>
+        <w:tblBorders>
+          <w:top w:val="nil"/>
+          <w:left w:val="nil"/>
+          <w:bottom w:val="nil"/>
+          <w:right w:val="nil"/>
+          <w:insideH w:val="nil"/>
+          <w:insideV w:val="nil"/>
+        </w:tblBorders>
+      </w:tblPr>
+      <w:tblGrid>
+        <w:gridCol w:w="4680"/>
+        <w:gridCol w:w="4680"/>
+      </w:tblGrid>
+      <w:tr>
+        <w:tc>
+          <w:tcPr>
+            <w:tcW w:type="dxa" w:w="4680"/>
+            <w:shd w:fill="F8F5EF"/>
+            <w:tcMar>
+              <w:top w:w="95" w:type="dxa"/>
+              <w:start w:w="95" w:type="dxa"/>
+              <w:bottom w:w="95" w:type="dxa"/>
+              <w:end w:w="95" w:type="dxa"/>
+            </w:tcMar>
+            <w:vAlign w:val="center"/>
+          </w:tcPr>
+          <w:p>
+            <w:pPr>
+              <w:jc w:val="center"/>
+            </w:pPr>
+            <w:r>
+              <w:drawing>
+                <wp:inline xmlns:a="http://schemas.openxmlformats.org/drawingml/2006/main" xmlns:pic="http://schemas.openxmlformats.org/drawingml/2006/picture">
+                  <wp:extent cx="2788920" cy="2091690"/>
+                  <wp:docPr id="6" name="Picture 6" descr="Pantai Melasti, Bali — Dare2Leap · CC BY-SA 4.0" title="Pantai Melasti, Bali — Dare2Leap · CC BY-SA 4.0"/>
+                  <wp:cNvGraphicFramePr>
+                    <a:graphicFrameLocks noChangeAspect="1"/>
+                  </wp:cNvGraphicFramePr>
+                  <a:graphic>
+                    <a:graphicData uri="http://schemas.openxmlformats.org/drawingml/2006/picture">
+                      <pic:pic>
+                        <pic:nvPicPr>
+                          <pic:cNvPr id="0" name="04-Dicky-Melasti-Beach.jpg"/>
+                          <pic:cNvPicPr/>
+                        </pic:nvPicPr>
+                        <pic:blipFill>
+                          <a:blip r:embed="rId16"/>
+                          <a:stretch>
+                            <a:fillRect/>
+                          </a:stretch>
+                        </pic:blipFill>
+                        <pic:spPr>
+                          <a:xfrm>
+                            <a:off x="0" y="0"/>
+                            <a:ext cx="2788920" cy="2091690"/>
+                          </a:xfrm>
+                          <a:prstGeom prst="rect"/>
+                        </pic:spPr>
+                      </pic:pic>
+                    </a:graphicData>
+                  </a:graphic>
+                </wp:inline>
+              </w:drawing>
+            </w:r>
+          </w:p>
+          <w:p>
+            <w:pPr>
+              <w:spacing w:before="40" w:after="0"/>
+              <w:jc w:val="center"/>
+            </w:pPr>
+            <w:r>
+              <w:rPr>
+                <w:rFonts w:ascii="Arial" w:hAnsi="Arial"/>
+                <w:b/>
+                <w:color w:val="0B4F46"/>
+                <w:sz w:val="16"/>
+              </w:rPr>
+              <w:t>04 · Pantai Melasti</w:t>
+            </w:r>
+          </w:p>
+          <w:p>
+            <w:pPr>
+              <w:spacing w:before="0" w:after="0"/>
+              <w:jc w:val="center"/>
+            </w:pPr>
+            <w:r>
+              <w:rPr>
+                <w:rFonts w:ascii="Arial" w:hAnsi="Arial"/>
+                <w:b w:val="0"/>
+                <w:color w:val="5E6B68"/>
+                <w:sz w:val="13"/>
+              </w:rPr>
+              <w:t>Dare2Leap · CC BY-SA 4.0</w:t>
+            </w:r>
+          </w:p>
+        </w:tc>
+        <w:tc>
+          <w:tcPr>
+            <w:tcW w:type="dxa" w:w="4680"/>
+            <w:shd w:fill="F8F5EF"/>
+            <w:tcMar>
+              <w:top w:w="95" w:type="dxa"/>
+              <w:start w:w="95" w:type="dxa"/>
+              <w:bottom w:w="95" w:type="dxa"/>
+              <w:end w:w="95" w:type="dxa"/>
+            </w:tcMar>
+            <w:vAlign w:val="center"/>
+          </w:tcPr>
+          <w:p>
+            <w:pPr>
+              <w:jc w:val="center"/>
+            </w:pPr>
+            <w:r>
+              <w:drawing>
+                <wp:inline xmlns:a="http://schemas.openxmlformats.org/drawingml/2006/main" xmlns:pic="http://schemas.openxmlformats.org/drawingml/2006/picture">
+                  <wp:extent cx="2788920" cy="1859861"/>
+                  <wp:docPr id="7" name="Picture 7" descr="Teluk Jimbaran, Bali — Simon Sees · CC BY 2.0" title="Teluk Jimbaran, Bali — Simon Sees · CC BY 2.0"/>
+                  <wp:cNvGraphicFramePr>
+                    <a:graphicFrameLocks noChangeAspect="1"/>
+                  </wp:cNvGraphicFramePr>
+                  <a:graphic>
+                    <a:graphicData uri="http://schemas.openxmlformats.org/drawingml/2006/picture">
+                      <pic:pic>
+                        <pic:nvPicPr>
+                          <pic:cNvPr id="0" name="05-Dicky-Jimbaran-Sunset.jpg"/>
+                          <pic:cNvPicPr/>
+                        </pic:nvPicPr>
+                        <pic:blipFill>
+                          <a:blip r:embed="rId17"/>
+                          <a:stretch>
+                            <a:fillRect/>
+                          </a:stretch>
+                        </pic:blipFill>
+                        <pic:spPr>
+                          <a:xfrm>
+                            <a:off x="0" y="0"/>
+                            <a:ext cx="2788920" cy="1859861"/>
+                          </a:xfrm>
+                          <a:prstGeom prst="rect"/>
+                        </pic:spPr>
+                      </pic:pic>
+                    </a:graphicData>
+                  </a:graphic>
+                </wp:inline>
+              </w:drawing>
+            </w:r>
+          </w:p>
+          <w:p>
+            <w:pPr>
+              <w:spacing w:before="40" w:after="0"/>
+              <w:jc w:val="center"/>
+            </w:pPr>
+            <w:r>
+              <w:rPr>
+                <w:rFonts w:ascii="Arial" w:hAnsi="Arial"/>
+                <w:b/>
+                <w:color w:val="0B4F46"/>
+                <w:sz w:val="16"/>
+              </w:rPr>
+              <w:t>05 · Teluk Jimbaran</w:t>
+            </w:r>
+          </w:p>
+          <w:p>
+            <w:pPr>
+              <w:spacing w:before="0" w:after="0"/>
+              <w:jc w:val="center"/>
+            </w:pPr>
+            <w:r>
+              <w:rPr>
+                <w:rFonts w:ascii="Arial" w:hAnsi="Arial"/>
+                <w:b w:val="0"/>
+                <w:color w:val="5E6B68"/>
+                <w:sz w:val="13"/>
+              </w:rPr>
+              <w:t>Simon Sees · CC BY 2.0</w:t>
+            </w:r>
+          </w:p>
+        </w:tc>
+      </w:tr>
+      <w:tr>
+        <w:tc>
+          <w:tcPr>
+            <w:tcW w:type="dxa" w:w="4680"/>
+            <w:shd w:fill="F8F5EF"/>
+            <w:tcMar>
+              <w:top w:w="95" w:type="dxa"/>
+              <w:start w:w="95" w:type="dxa"/>
+              <w:bottom w:w="95" w:type="dxa"/>
+              <w:end w:w="95" w:type="dxa"/>
+            </w:tcMar>
+            <w:vAlign w:val="center"/>
+          </w:tcPr>
+          <w:p>
+            <w:pPr>
+              <w:jc w:val="center"/>
+            </w:pPr>
+            <w:r>
+              <w:drawing>
+                <wp:inline xmlns:a="http://schemas.openxmlformats.org/drawingml/2006/main" xmlns:pic="http://schemas.openxmlformats.org/drawingml/2006/picture">
+                  <wp:extent cx="2788920" cy="1859861"/>
+                  <wp:docPr id="8" name="Picture 8" descr="Broken Beach, Bali — Aaron Rentfrew · CC BY-SA 4.0" title="Broken Beach, Bali — Aaron Rentfrew · CC BY-SA 4.0"/>
+                  <wp:cNvGraphicFramePr>
+                    <a:graphicFrameLocks noChangeAspect="1"/>
+                  </wp:cNvGraphicFramePr>
+                  <a:graphic>
+                    <a:graphicData uri="http://schemas.openxmlformats.org/drawingml/2006/picture">
+                      <pic:pic>
+                        <pic:nvPicPr>
+                          <pic:cNvPr id="0" name="06-Dicky-Broken-Beach.jpg"/>
+                          <pic:cNvPicPr/>
+                        </pic:nvPicPr>
+                        <pic:blipFill>
+                          <a:blip r:embed="rId18"/>
+                          <a:stretch>
+                            <a:fillRect/>
+                          </a:stretch>
+                        </pic:blipFill>
+                        <pic:spPr>
+                          <a:xfrm>
+                            <a:off x="0" y="0"/>
+                            <a:ext cx="2788920" cy="1859861"/>
+                          </a:xfrm>
+                          <a:prstGeom prst="rect"/>
+                        </pic:spPr>
+                      </pic:pic>
+                    </a:graphicData>
+                  </a:graphic>
+                </wp:inline>
+              </w:drawing>
+            </w:r>
+          </w:p>
+          <w:p>
+            <w:pPr>
+              <w:spacing w:before="40" w:after="0"/>
+              <w:jc w:val="center"/>
+            </w:pPr>
+            <w:r>
+              <w:rPr>
+                <w:rFonts w:ascii="Arial" w:hAnsi="Arial"/>
+                <w:b/>
+                <w:color w:val="0B4F46"/>
+                <w:sz w:val="16"/>
+              </w:rPr>
+              <w:t>06 · Broken Beach</w:t>
+            </w:r>
+          </w:p>
+          <w:p>
+            <w:pPr>
+              <w:spacing w:before="0" w:after="0"/>
+              <w:jc w:val="center"/>
+            </w:pPr>
+            <w:r>
+              <w:rPr>
+                <w:rFonts w:ascii="Arial" w:hAnsi="Arial"/>
+                <w:b w:val="0"/>
+                <w:color w:val="5E6B68"/>
+                <w:sz w:val="13"/>
+              </w:rPr>
+              <w:t>Aaron Rentfrew · CC BY-SA 4.0</w:t>
+            </w:r>
+          </w:p>
+        </w:tc>
+        <w:tc>
+          <w:tcPr>
+            <w:tcW w:type="dxa" w:w="4680"/>
+            <w:shd w:fill="F8F5EF"/>
+            <w:tcMar>
+              <w:top w:w="95" w:type="dxa"/>
+              <w:start w:w="95" w:type="dxa"/>
+              <w:bottom w:w="95" w:type="dxa"/>
+              <w:end w:w="95" w:type="dxa"/>
+            </w:tcMar>
+            <w:vAlign w:val="center"/>
+          </w:tcPr>
+          <w:p>
+            <w:pPr>
+              <w:jc w:val="center"/>
+            </w:pPr>
+            <w:r>
+              <w:drawing>
+                <wp:inline xmlns:a="http://schemas.openxmlformats.org/drawingml/2006/main" xmlns:pic="http://schemas.openxmlformats.org/drawingml/2006/picture">
+                  <wp:extent cx="2788920" cy="1854632"/>
+                  <wp:docPr id="9" name="Picture 9" descr="Tegallalang, Bali — Philip Nalangan · CC BY 4.0" title="Tegallalang, Bali — Philip Nalangan · CC BY 4.0"/>
+                  <wp:cNvGraphicFramePr>
+                    <a:graphicFrameLocks noChangeAspect="1"/>
+                  </wp:cNvGraphicFramePr>
+                  <a:graphic>
+                    <a:graphicData uri="http://schemas.openxmlformats.org/drawingml/2006/picture">
+                      <pic:pic>
+                        <pic:nvPicPr>
+                          <pic:cNvPr id="0" name="07-Dicky-Tegallalang.jpg"/>
+                          <pic:cNvPicPr/>
+                        </pic:nvPicPr>
+                        <pic:blipFill>
+                          <a:blip r:embed="rId19"/>
+                          <a:stretch>
+                            <a:fillRect/>
+                          </a:stretch>
+                        </pic:blipFill>
+                        <pic:spPr>
+                          <a:xfrm>
+                            <a:off x="0" y="0"/>
+                            <a:ext cx="2788920" cy="1854632"/>
+                          </a:xfrm>
+                          <a:prstGeom prst="rect"/>
+                        </pic:spPr>
+                      </pic:pic>
+                    </a:graphicData>
+                  </a:graphic>
+                </wp:inline>
+              </w:drawing>
+            </w:r>
+          </w:p>
+          <w:p>
+            <w:pPr>
+              <w:spacing w:before="40" w:after="0"/>
+              <w:jc w:val="center"/>
+            </w:pPr>
+            <w:r>
+              <w:rPr>
+                <w:rFonts w:ascii="Arial" w:hAnsi="Arial"/>
+                <w:b/>
+                <w:color w:val="0B4F46"/>
+                <w:sz w:val="16"/>
+              </w:rPr>
+              <w:t>07 · Tegallalang</w:t>
+            </w:r>
+          </w:p>
+          <w:p>
+            <w:pPr>
+              <w:spacing w:before="0" w:after="0"/>
+              <w:jc w:val="center"/>
+            </w:pPr>
+            <w:r>
+              <w:rPr>
+                <w:rFonts w:ascii="Arial" w:hAnsi="Arial"/>
+                <w:b w:val="0"/>
+                <w:color w:val="5E6B68"/>
+                <w:sz w:val="13"/>
+              </w:rPr>
+              <w:t>Philip Nalangan · CC BY 4.0</w:t>
+            </w:r>
+          </w:p>
+        </w:tc>
+      </w:tr>
+    </w:tbl>
+    <w:p>
+      <w:r>
+        <w:br w:type="page"/>
+      </w:r>
+    </w:p>
+    <w:p>
+      <w:pPr>
+        <w:spacing w:before="0" w:after="60"/>
+      </w:pPr>
+      <w:r>
+        <w:rPr>
+          <w:rFonts w:ascii="Arial" w:hAnsi="Arial"/>
+          <w:b/>
+          <w:color w:val="E0A11A"/>
+          <w:sz w:val="16"/>
+        </w:rPr>
+        <w:t>INSTAGRAM · FACEBOOK · WHATSAPP</w:t>
+      </w:r>
+    </w:p>
+    <w:p>
+      <w:pPr>
+        <w:keepNext/>
+        <w:spacing w:before="0" w:after="100"/>
+      </w:pPr>
+      <w:r>
+        <w:rPr>
+          <w:rFonts w:ascii="Arial" w:hAnsi="Arial"/>
+          <w:b/>
+          <w:color w:val="0B4F46"/>
+          <w:sz w:val="44"/>
+        </w:rPr>
+        <w:t>Posting kedua: empat pemandangan</w:t>
+      </w:r>
+    </w:p>
+    <w:p>
+      <w:pPr>
+        <w:spacing w:before="0" w:after="160" w:line="269" w:lineRule="auto"/>
+      </w:pPr>
+      <w:r>
+        <w:rPr>
+          <w:rFonts w:ascii="Arial" w:hAnsi="Arial"/>
+          <w:b w:val="0"/>
+          <w:color w:val="1E2D2A"/>
+          <w:sz w:val="18"/>
+        </w:rPr>
+        <w:t>Pilih foto 04, 05, 06, dan 07 sebagai carousel. Salin teks di bawah, lalu tambahkan tautan pribadi pada bio, Story, atau pesan langsung.</w:t>
+      </w:r>
+    </w:p>
+    <w:tbl>
+      <w:tblPr>
+        <w:tblW w:type="dxa" w:w="9360"/>
+        <w:jc w:val="center"/>
+        <w:tblLayout w:type="fixed"/>
+        <w:tblLook w:firstColumn="1" w:firstRow="1" w:lastColumn="0" w:lastRow="0" w:noHBand="0" w:noVBand="1" w:val="04A0"/>
+        <w:tblBorders>
+          <w:top w:val="nil"/>
+          <w:left w:val="nil"/>
+          <w:bottom w:val="nil"/>
+          <w:right w:val="nil"/>
+          <w:insideH w:val="nil"/>
+          <w:insideV w:val="nil"/>
+        </w:tblBorders>
+      </w:tblPr>
+      <w:tblGrid>
+        <w:gridCol w:w="9360"/>
+      </w:tblGrid>
+      <w:tr>
+        <w:tc>
+          <w:tcPr>
+            <w:tcW w:type="dxa" w:w="9360"/>
+            <w:shd w:fill="E8F1EF"/>
+            <w:tcMar>
+              <w:top w:w="170" w:type="dxa"/>
+              <w:start w:w="190" w:type="dxa"/>
+              <w:bottom w:w="170" w:type="dxa"/>
+              <w:end w:w="190" w:type="dxa"/>
+            </w:tcMar>
+          </w:tcPr>
+          <w:p>
+            <w:pPr>
+              <w:spacing w:after="80"/>
+            </w:pPr>
+            <w:r>
+              <w:rPr>
+                <w:rFonts w:ascii="Arial" w:hAnsi="Arial"/>
+                <w:b/>
+                <w:color w:val="0B4F46"/>
+                <w:sz w:val="16"/>
+              </w:rPr>
+              <w:t>SALIN · BAHASA INDONESIA</w:t>
+            </w:r>
+          </w:p>
+          <w:p>
+            <w:pPr>
+              <w:spacing w:after="0" w:line="269" w:lineRule="auto"/>
+            </w:pPr>
+            <w:r>
+              <w:rPr>
+                <w:rFonts w:ascii="Arial" w:hAnsi="Arial"/>
+                <w:b w:val="0"/>
+                <w:color w:val="1E2D2A"/>
+                <w:sz w:val="18"/>
+              </w:rPr>
+              <w:t>Empat wajah Bali dalam satu perjalanan: tebing selatan di Melasti, matahari terbenam di Jimbaran, lengkungan laut Broken Beach, dan sawah bertingkat Tegallalang. Simpan inspirasinya, lalu buka tautan pribadi saya untuk mengirim rencana. Rute, tanggal, kendaraan, durasi, dan harga akhir tetap dikonfirmasi setelah permintaan masuk.</w:t>
+              <w:br/>
+              <w:br/>
+              <w:t>https://wandermind.cc/find-driver?driver_id=dicky&amp;utm_source=driver_dicky&amp;utm_medium=instagram&amp;utm_campaign=bali_driver_launch</w:t>
+            </w:r>
+          </w:p>
+        </w:tc>
+      </w:tr>
+    </w:tbl>
+    <w:p>
+      <w:pPr>
+        <w:spacing w:after="0"/>
+      </w:pPr>
+    </w:p>
+    <w:tbl>
+      <w:tblPr>
+        <w:tblW w:type="dxa" w:w="9360"/>
+        <w:jc w:val="center"/>
+        <w:tblLayout w:type="fixed"/>
+        <w:tblLook w:firstColumn="1" w:firstRow="1" w:lastColumn="0" w:lastRow="0" w:noHBand="0" w:noVBand="1" w:val="04A0"/>
+        <w:tblBorders>
+          <w:top w:val="nil"/>
+          <w:left w:val="nil"/>
+          <w:bottom w:val="nil"/>
+          <w:right w:val="nil"/>
+          <w:insideH w:val="nil"/>
+          <w:insideV w:val="nil"/>
+        </w:tblBorders>
+      </w:tblPr>
+      <w:tblGrid>
+        <w:gridCol w:w="9360"/>
+      </w:tblGrid>
+      <w:tr>
+        <w:tc>
+          <w:tcPr>
+            <w:tcW w:type="dxa" w:w="9360"/>
+            <w:shd w:fill="E8F1EF"/>
+            <w:tcMar>
+              <w:top w:w="170" w:type="dxa"/>
+              <w:start w:w="190" w:type="dxa"/>
+              <w:bottom w:w="170" w:type="dxa"/>
+              <w:end w:w="190" w:type="dxa"/>
+            </w:tcMar>
+          </w:tcPr>
+          <w:p>
+            <w:pPr>
+              <w:spacing w:after="80"/>
+            </w:pPr>
+            <w:r>
+              <w:rPr>
+                <w:rFonts w:ascii="Arial" w:hAnsi="Arial"/>
+                <w:b/>
+                <w:color w:val="0B4F46"/>
+                <w:sz w:val="16"/>
+              </w:rPr>
+              <w:t>COPY · ENGLISH</w:t>
+            </w:r>
+          </w:p>
+          <w:p>
+            <w:pPr>
+              <w:spacing w:after="0" w:line="269" w:lineRule="auto"/>
+            </w:pPr>
+            <w:r>
+              <w:rPr>
+                <w:rFonts w:ascii="Arial" w:hAnsi="Arial"/>
+                <w:b w:val="0"/>
+                <w:color w:val="1E2D2A"/>
+                <w:sz w:val="18"/>
+              </w:rPr>
+              <w:t>Four sides of Bali in one journey: Melasti's southern coast, sunset at Jimbaran, Broken Beach's natural arch, and Tegallalang's rice terraces. Save the inspiration, then open my personal WanderMind link to send your plan. Route, date, vehicle, duration, and final price are confirmed after the request is received.</w:t>
+              <w:br/>
+              <w:br/>
+              <w:t>https://wandermind.cc/find-driver?driver_id=dicky&amp;utm_source=driver_dicky&amp;utm_medium=instagram&amp;utm_campaign=bali_driver_launch</w:t>
+            </w:r>
+          </w:p>
+        </w:tc>
+      </w:tr>
+    </w:tbl>
+    <w:p>
+      <w:pPr>
+        <w:spacing w:after="0"/>
+      </w:pPr>
+    </w:p>
+    <w:p>
+      <w:pPr>
+        <w:spacing w:before="0" w:after="60"/>
+      </w:pPr>
+      <w:r>
+        <w:rPr>
+          <w:rFonts w:ascii="Arial" w:hAnsi="Arial"/>
+          <w:b/>
+          <w:color w:val="E0A11A"/>
+          <w:sz w:val="16"/>
+        </w:rPr>
+        <w:t>KREDIT FOTO — JANGAN DIHAPUS</w:t>
+      </w:r>
+    </w:p>
+    <w:p>
+      <w:pPr>
+        <w:spacing w:before="0" w:after="40"/>
+      </w:pPr>
+      <w:r>
+        <w:rPr>
+          <w:rFonts w:ascii="Arial" w:hAnsi="Arial"/>
+          <w:b w:val="0"/>
+          <w:color w:val="5E6B68"/>
+          <w:sz w:val="14"/>
+        </w:rPr>
+        <w:t xml:space="preserve">04 · Pantai Melasti · Dare2Leap · CC BY-SA 4.0 · </w:t>
+      </w:r>
+      <w:hyperlink r:id="rId20">
+        <w:r>
+          <w:rPr>
+            <w:color w:val="0B4F46"/>
+            <w:u w:val="single"/>
+            <w:sz w:val="15"/>
+          </w:rPr>
+          <w:t>sumber</w:t>
+        </w:r>
+      </w:hyperlink>
+      <w:r>
+        <w:rPr>
+          <w:rFonts w:ascii="Arial" w:hAnsi="Arial"/>
+          <w:b w:val="0"/>
+          <w:color w:val="5E6B68"/>
+          <w:sz w:val="14"/>
+        </w:rPr>
+        <w:t xml:space="preserve"> · </w:t>
+      </w:r>
+      <w:hyperlink r:id="rId21">
+        <w:r>
+          <w:rPr>
+            <w:color w:val="0B4F46"/>
+            <w:u w:val="single"/>
+            <w:sz w:val="15"/>
+          </w:rPr>
+          <w:t>lisensi</w:t>
+        </w:r>
+      </w:hyperlink>
+    </w:p>
+    <w:p>
+      <w:pPr>
+        <w:spacing w:before="0" w:after="40"/>
+      </w:pPr>
+      <w:r>
+        <w:rPr>
+          <w:rFonts w:ascii="Arial" w:hAnsi="Arial"/>
+          <w:b w:val="0"/>
+          <w:color w:val="5E6B68"/>
+          <w:sz w:val="14"/>
+        </w:rPr>
+        <w:t xml:space="preserve">05 · Teluk Jimbaran · Simon Sees · CC BY 2.0 · </w:t>
+      </w:r>
+      <w:hyperlink r:id="rId22">
+        <w:r>
+          <w:rPr>
+            <w:color w:val="0B4F46"/>
+            <w:u w:val="single"/>
+            <w:sz w:val="15"/>
+          </w:rPr>
+          <w:t>sumber</w:t>
+        </w:r>
+      </w:hyperlink>
+      <w:r>
+        <w:rPr>
+          <w:rFonts w:ascii="Arial" w:hAnsi="Arial"/>
+          <w:b w:val="0"/>
+          <w:color w:val="5E6B68"/>
+          <w:sz w:val="14"/>
+        </w:rPr>
+        <w:t xml:space="preserve"> · </w:t>
+      </w:r>
+      <w:hyperlink r:id="rId23">
+        <w:r>
+          <w:rPr>
+            <w:color w:val="0B4F46"/>
+            <w:u w:val="single"/>
+            <w:sz w:val="15"/>
+          </w:rPr>
+          <w:t>lisensi</w:t>
+        </w:r>
+      </w:hyperlink>
+    </w:p>
+    <w:p>
+      <w:pPr>
+        <w:spacing w:before="0" w:after="40"/>
+      </w:pPr>
+      <w:r>
+        <w:rPr>
+          <w:rFonts w:ascii="Arial" w:hAnsi="Arial"/>
+          <w:b w:val="0"/>
+          <w:color w:val="5E6B68"/>
+          <w:sz w:val="14"/>
+        </w:rPr>
+        <w:t xml:space="preserve">06 · Broken Beach · Aaron Rentfrew · CC BY-SA 4.0 · </w:t>
+      </w:r>
+      <w:hyperlink r:id="rId24">
+        <w:r>
+          <w:rPr>
+            <w:color w:val="0B4F46"/>
+            <w:u w:val="single"/>
+            <w:sz w:val="15"/>
+          </w:rPr>
+          <w:t>sumber</w:t>
+        </w:r>
+      </w:hyperlink>
+      <w:r>
+        <w:rPr>
+          <w:rFonts w:ascii="Arial" w:hAnsi="Arial"/>
+          <w:b w:val="0"/>
+          <w:color w:val="5E6B68"/>
+          <w:sz w:val="14"/>
+        </w:rPr>
+        <w:t xml:space="preserve"> · </w:t>
+      </w:r>
+      <w:hyperlink r:id="rId21">
+        <w:r>
+          <w:rPr>
+            <w:color w:val="0B4F46"/>
+            <w:u w:val="single"/>
+            <w:sz w:val="15"/>
+          </w:rPr>
+          <w:t>lisensi</w:t>
+        </w:r>
+      </w:hyperlink>
+    </w:p>
+    <w:p>
+      <w:pPr>
+        <w:spacing w:before="0" w:after="40"/>
+      </w:pPr>
+      <w:r>
+        <w:rPr>
+          <w:rFonts w:ascii="Arial" w:hAnsi="Arial"/>
+          <w:b w:val="0"/>
+          <w:color w:val="5E6B68"/>
+          <w:sz w:val="14"/>
+        </w:rPr>
+        <w:t xml:space="preserve">07 · Tegallalang · Philip Nalangan · CC BY 4.0 · </w:t>
+      </w:r>
+      <w:hyperlink r:id="rId25">
+        <w:r>
+          <w:rPr>
+            <w:color w:val="0B4F46"/>
+            <w:u w:val="single"/>
+            <w:sz w:val="15"/>
+          </w:rPr>
+          <w:t>sumber</w:t>
+        </w:r>
+      </w:hyperlink>
+      <w:r>
+        <w:rPr>
+          <w:rFonts w:ascii="Arial" w:hAnsi="Arial"/>
+          <w:b w:val="0"/>
+          <w:color w:val="5E6B68"/>
+          <w:sz w:val="14"/>
+        </w:rPr>
+        <w:t xml:space="preserve"> · </w:t>
+      </w:r>
+      <w:hyperlink r:id="rId26">
+        <w:r>
+          <w:rPr>
+            <w:color w:val="0B4F46"/>
+            <w:u w:val="single"/>
+            <w:sz w:val="15"/>
+          </w:rPr>
+          <w:t>lisensi</w:t>
+        </w:r>
+      </w:hyperlink>
+    </w:p>
+    <w:p>
+      <w:pPr>
+        <w:spacing w:before="0" w:after="0" w:line="269" w:lineRule="auto"/>
+      </w:pPr>
+      <w:r>
+        <w:rPr>
+          <w:rFonts w:ascii="Arial" w:hAnsi="Arial"/>
+          <w:b w:val="0"/>
+          <w:color w:val="5E6B68"/>
+          <w:sz w:val="15"/>
+        </w:rPr>
+        <w:t>Foto berlisensi tidak boleh ditulis sebagai hasil foto pribadi. Versi WanderMind hanya disalin untuk paket promosi ini; ketentuan atribusi dan share-alike tetap berlaku.</w:t>
+      </w:r>
     </w:p>
     <w:sectPr>
       <w:footerReference w:type="default" r:id="rId9"/>

</xml_diff>